<commit_message>
Reorder all three client reports top-down, with a hook line
Each report now opens with a one-sentence hook, the key-figure strip and the
headline chart; supporting detail (value tables, task breakdown, what each use
case adds, break-even, sensitivity, running cost) follows, and method, basis and
limits close the document. Hook and accuracy sentences are worded from the
measured results. Test report: speed folded into a note, now 3 pages.

Co-Authored-By: Claude Opus 5.5 <noreply@anthropic.com>
Claude-Session: https://claude.ai/code/session_019PF9w5va6U3p9NbQBxRQZc
</commit_message>
<xml_diff>
--- a/evals/roi/UseCase1_ROI.docx
+++ b/evals/roi/UseCase1_ROI.docx
@@ -29,26 +29,18 @@
     </w:p>
     <w:p>
       <w:pPr>
-        <w:pStyle w:val="Heading1"/>
-      </w:pPr>
-      <w:r>
-        <w:t xml:space="preserve">Summary</w:t>
-      </w:r>
-    </w:p>
-    <w:p>
-      <w:pPr>
-        <w:keepNext w:val="false"/>
-      </w:pPr>
-      <w:r>
-        <w:t xml:space="preserve">Each wire transaction comes with a wire instruction document. Today a person reads each document and keys the beneficiary, bank, routing number and account number, which takes about 1 minute per document: 20 minutes for the 20 documents that arrive on a typical day. Our system processes the same 20 documents in 1 minute, 20 times faster.</w:t>
-      </w:r>
-    </w:p>
-    <w:p>
-      <w:pPr>
-        <w:keepNext w:val="false"/>
-      </w:pPr>
-      <w:r>
-        <w:t xml:space="preserve">That returns about 19 minutes a day, or 79 staff hours a year, worth about $4k a year before running costs and $3k after them. The value grows in step with volume: at 160 documents a day the system needs 8 minutes where a person would need 2.7 hours. In testing it read 200 of 200 routing and account numbers correctly and flagged every value it got wrong for a person to check.</w:t>
+        <w:spacing w:after="160" w:line="300" w:lineRule="auto"/>
+      </w:pPr>
+      <w:r>
+        <w:rPr>
+          <w:rFonts w:ascii="Arial" w:cs="Arial" w:eastAsia="Arial" w:hAnsi="Arial"/>
+          <w:b/>
+          <w:bCs/>
+          <w:color w:val="1F4E8C"/>
+          <w:sz w:val="30"/>
+          <w:szCs w:val="30"/>
+        </w:rPr>
+        <w:t xml:space="preserve">A day's 20 wire documents, processed in 1 minute instead of 20, with every routing and account number read correctly in testing.</w:t>
       </w:r>
     </w:p>
     <w:tbl>
@@ -96,7 +88,7 @@
                 <w:sz w:val="28"/>
                 <w:szCs w:val="28"/>
               </w:rPr>
-              <w:t xml:space="preserve">20 → 1 min</w:t>
+              <w:t xml:space="preserve">20×</w:t>
             </w:r>
           </w:p>
           <w:p>
@@ -107,7 +99,7 @@
                 <w:sz w:val="16"/>
                 <w:szCs w:val="16"/>
               </w:rPr>
-              <w:t xml:space="preserve">to process 20 wire documents</w:t>
+              <w:t xml:space="preserve">faster than processing by hand</w:t>
             </w:r>
           </w:p>
         </w:tc>
@@ -137,7 +129,7 @@
                 <w:sz w:val="28"/>
                 <w:szCs w:val="28"/>
               </w:rPr>
-              <w:t xml:space="preserve">20×</w:t>
+              <w:t xml:space="preserve">20 → 1 min</w:t>
             </w:r>
           </w:p>
           <w:p>
@@ -148,7 +140,7 @@
                 <w:sz w:val="16"/>
                 <w:szCs w:val="16"/>
               </w:rPr>
-              <w:t xml:space="preserve">faster than processing by hand</w:t>
+              <w:t xml:space="preserve">to process 20 wire documents</w:t>
             </w:r>
           </w:p>
         </w:tc>
@@ -178,7 +170,7 @@
                 <w:sz w:val="28"/>
                 <w:szCs w:val="28"/>
               </w:rPr>
-              <w:t xml:space="preserve">79 h</w:t>
+              <w:t xml:space="preserve">100%</w:t>
             </w:r>
           </w:p>
           <w:p>
@@ -189,7 +181,7 @@
                 <w:sz w:val="16"/>
                 <w:szCs w:val="16"/>
               </w:rPr>
-              <w:t xml:space="preserve">staff hours returned per year at 20 documents a day</w:t>
+              <w:t xml:space="preserve">routing and account numbers read correctly in testing</w:t>
             </w:r>
           </w:p>
         </w:tc>
@@ -219,7 +211,7 @@
                 <w:sz w:val="28"/>
                 <w:szCs w:val="28"/>
               </w:rPr>
-              <w:t xml:space="preserve">100%</w:t>
+              <w:t xml:space="preserve">79 h</w:t>
             </w:r>
           </w:p>
           <w:p>
@@ -230,7 +222,7 @@
                 <w:sz w:val="16"/>
                 <w:szCs w:val="16"/>
               </w:rPr>
-              <w:t xml:space="preserve">routing and account numbers read correctly in testing</w:t>
+              <w:t xml:space="preserve">staff hours returned per year at 20 documents a day</w:t>
             </w:r>
           </w:p>
         </w:tc>
@@ -240,22 +232,6 @@
       <w:pPr>
         <w:spacing w:after="80"/>
       </w:pPr>
-    </w:p>
-    <w:p>
-      <w:pPr>
-        <w:pStyle w:val="Heading1"/>
-      </w:pPr>
-      <w:r>
-        <w:t xml:space="preserve">Time per day</w:t>
-      </w:r>
-    </w:p>
-    <w:p>
-      <w:pPr>
-        <w:keepNext w:val="false"/>
-      </w:pPr>
-      <w:r>
-        <w:t xml:space="preserve">A person finds each detail in the wire instruction, types it into the workbook and checks it back. The system reads the document, fills in the details and highlights any field that needs a closer look.</w:t>
-      </w:r>
     </w:p>
     <w:p>
       <w:pPr>
@@ -347,18 +323,18 @@
     </w:p>
     <w:p>
       <w:pPr>
+        <w:keepNext w:val="false"/>
+      </w:pPr>
+      <w:r>
+        <w:t xml:space="preserve">Each wire transaction comes with a wire instruction document. Today a person reads each one and keys the beneficiary, bank, routing number and account number. The system reads the document, fills in those details and highlights any field that needs a closer look, so the time a person spends goes to checking rather than typing.</w:t>
+      </w:r>
+    </w:p>
+    <w:p>
+      <w:pPr>
         <w:pStyle w:val="Heading1"/>
       </w:pPr>
       <w:r>
         <w:t xml:space="preserve">Accuracy</w:t>
-      </w:r>
-    </w:p>
-    <w:p>
-      <w:pPr>
-        <w:keepNext w:val="false"/>
-      </w:pPr>
-      <w:r>
-        <w:t xml:space="preserve">The wire step was tested on six synthetic wire instruction layouts chosen to be hard to read: repeated digits, small type in dense tables, fax-quality scans and details on a second page, all scanned to images. 18 live readings of those layouts were run 100 times through the production software, which scores every value and decides what to flag.</w:t>
       </w:r>
     </w:p>
     <w:p>
@@ -454,7 +430,7 @@
         <w:keepNext w:val="false"/>
       </w:pPr>
       <w:r>
-        <w:t xml:space="preserve">Mistral Document AI turns each page into text and gpt-6-luna extracts the fields from that text. Mistral's own reading of the page serves as a check: a field is flagged when the two disagree, when its confidence is low, or, for routing numbers, when the ABA check digit fails. On average 0.9 of the six fields are flagged per document. A character misread when the page is turned into text would pass the other checks; the check digit catches that for routing numbers, and for the other fields the reviewer's comparison with the document remains the control.</w:t>
+        <w:t xml:space="preserve">Every value the system got wrong was flagged for a person to check. Mistral Document AI turns each page into text and gpt-6-luna extracts the fields from that text. Mistral's own reading of the page serves as a check: a field is flagged when the two disagree, when its confidence is low, or, for routing numbers, when the ABA check digit fails. On average 0.9 of the six fields are flagged per document.</w:t>
       </w:r>
     </w:p>
     <w:p>
@@ -462,412 +438,15 @@
         <w:pStyle w:val="Heading1"/>
       </w:pPr>
       <w:r>
-        <w:t xml:space="preserve">Annual value</w:t>
-      </w:r>
-    </w:p>
-    <w:tbl>
-      <w:tblPr>
-        <w:tblW w:type="dxa" w:w="9640"/>
-        <w:tblBorders>
-          <w:top w:val="single" w:color="auto" w:sz="4"/>
-          <w:left w:val="single" w:color="auto" w:sz="4"/>
-          <w:bottom w:val="single" w:color="auto" w:sz="4"/>
-          <w:right w:val="single" w:color="auto" w:sz="4"/>
-          <w:insideH w:val="single" w:color="auto" w:sz="4"/>
-          <w:insideV w:val="single" w:color="auto" w:sz="4"/>
-        </w:tblBorders>
-      </w:tblPr>
-      <w:tblGrid>
-        <w:gridCol w:w="5977"/>
-        <w:gridCol w:w="3663"/>
-      </w:tblGrid>
-      <w:tr>
-        <w:trPr>
-          <w:cantSplit/>
-        </w:trPr>
-        <w:tc>
-          <w:tcPr>
-            <w:tcW w:type="dxa" w:w="5977"/>
-            <w:tcBorders>
-              <w:top w:val="none" w:color="FFFFFF" w:sz="0"/>
-              <w:left w:val="none" w:color="FFFFFF" w:sz="0"/>
-              <w:bottom w:val="single" w:color="D9D7CF" w:sz="4"/>
-              <w:right w:val="none" w:color="FFFFFF" w:sz="0"/>
-            </w:tcBorders>
-            <w:tcMar>
-              <w:top w:type="dxa" w:w="50"/>
-              <w:left w:type="dxa" w:w="0"/>
-              <w:bottom w:type="dxa" w:w="50"/>
-              <w:right w:type="dxa" w:w="120"/>
-            </w:tcMar>
-            <w:vAlign w:val="top"/>
-          </w:tcPr>
-          <w:p>
-            <w:pPr>
-              <w:keepNext/>
-              <w:jc w:val="left"/>
-            </w:pPr>
-            <w:r>
-              <w:rPr>
-                <w:rFonts w:ascii="Arial" w:cs="Arial" w:eastAsia="Arial" w:hAnsi="Arial"/>
-                <w:b w:val="false"/>
-                <w:bCs w:val="false"/>
-                <w:color w:val="1D1D1B"/>
-                <w:sz w:val="18"/>
-                <w:szCs w:val="18"/>
-              </w:rPr>
-              <w:t xml:space="preserve">Documents per year (20 a day, 250 working days)</w:t>
-            </w:r>
-          </w:p>
-        </w:tc>
-        <w:tc>
-          <w:tcPr>
-            <w:tcW w:type="dxa" w:w="3663"/>
-            <w:tcBorders>
-              <w:top w:val="none" w:color="FFFFFF" w:sz="0"/>
-              <w:left w:val="none" w:color="FFFFFF" w:sz="0"/>
-              <w:bottom w:val="single" w:color="D9D7CF" w:sz="4"/>
-              <w:right w:val="none" w:color="FFFFFF" w:sz="0"/>
-            </w:tcBorders>
-            <w:tcMar>
-              <w:top w:type="dxa" w:w="50"/>
-              <w:left w:type="dxa" w:w="0"/>
-              <w:bottom w:type="dxa" w:w="50"/>
-              <w:right w:type="dxa" w:w="120"/>
-            </w:tcMar>
-            <w:vAlign w:val="top"/>
-          </w:tcPr>
-          <w:p>
-            <w:pPr>
-              <w:keepNext/>
-              <w:jc w:val="right"/>
-            </w:pPr>
-            <w:r>
-              <w:rPr>
-                <w:rFonts w:ascii="Arial" w:cs="Arial" w:eastAsia="Arial" w:hAnsi="Arial"/>
-                <w:b w:val="false"/>
-                <w:bCs w:val="false"/>
-                <w:color w:val="1D1D1B"/>
-                <w:sz w:val="18"/>
-                <w:szCs w:val="18"/>
-              </w:rPr>
-              <w:t xml:space="preserve">5,000</w:t>
-            </w:r>
-          </w:p>
-        </w:tc>
-      </w:tr>
-      <w:tr>
-        <w:trPr>
-          <w:cantSplit/>
-        </w:trPr>
-        <w:tc>
-          <w:tcPr>
-            <w:tcW w:type="dxa" w:w="5977"/>
-            <w:tcBorders>
-              <w:top w:val="none" w:color="FFFFFF" w:sz="0"/>
-              <w:left w:val="none" w:color="FFFFFF" w:sz="0"/>
-              <w:bottom w:val="single" w:color="D9D7CF" w:sz="4"/>
-              <w:right w:val="none" w:color="FFFFFF" w:sz="0"/>
-            </w:tcBorders>
-            <w:tcMar>
-              <w:top w:type="dxa" w:w="50"/>
-              <w:left w:type="dxa" w:w="0"/>
-              <w:bottom w:type="dxa" w:w="50"/>
-              <w:right w:type="dxa" w:w="120"/>
-            </w:tcMar>
-            <w:vAlign w:val="top"/>
-          </w:tcPr>
-          <w:p>
-            <w:pPr>
-              <w:keepNext/>
-              <w:jc w:val="left"/>
-            </w:pPr>
-            <w:r>
-              <w:rPr>
-                <w:rFonts w:ascii="Arial" w:cs="Arial" w:eastAsia="Arial" w:hAnsi="Arial"/>
-                <w:b w:val="false"/>
-                <w:bCs w:val="false"/>
-                <w:color w:val="1D1D1B"/>
-                <w:sz w:val="18"/>
-                <w:szCs w:val="18"/>
-              </w:rPr>
-              <w:t xml:space="preserve">Staff hours returned per year</w:t>
-            </w:r>
-          </w:p>
-        </w:tc>
-        <w:tc>
-          <w:tcPr>
-            <w:tcW w:type="dxa" w:w="3663"/>
-            <w:tcBorders>
-              <w:top w:val="none" w:color="FFFFFF" w:sz="0"/>
-              <w:left w:val="none" w:color="FFFFFF" w:sz="0"/>
-              <w:bottom w:val="single" w:color="D9D7CF" w:sz="4"/>
-              <w:right w:val="none" w:color="FFFFFF" w:sz="0"/>
-            </w:tcBorders>
-            <w:tcMar>
-              <w:top w:type="dxa" w:w="50"/>
-              <w:left w:type="dxa" w:w="0"/>
-              <w:bottom w:type="dxa" w:w="50"/>
-              <w:right w:type="dxa" w:w="120"/>
-            </w:tcMar>
-            <w:vAlign w:val="top"/>
-          </w:tcPr>
-          <w:p>
-            <w:pPr>
-              <w:keepNext/>
-              <w:jc w:val="right"/>
-            </w:pPr>
-            <w:r>
-              <w:rPr>
-                <w:rFonts w:ascii="Arial" w:cs="Arial" w:eastAsia="Arial" w:hAnsi="Arial"/>
-                <w:b w:val="false"/>
-                <w:bCs w:val="false"/>
-                <w:color w:val="1D1D1B"/>
-                <w:sz w:val="18"/>
-                <w:szCs w:val="18"/>
-              </w:rPr>
-              <w:t xml:space="preserve">79</w:t>
-            </w:r>
-          </w:p>
-        </w:tc>
-      </w:tr>
-      <w:tr>
-        <w:trPr>
-          <w:cantSplit/>
-        </w:trPr>
-        <w:tc>
-          <w:tcPr>
-            <w:tcW w:type="dxa" w:w="5977"/>
-            <w:tcBorders>
-              <w:top w:val="none" w:color="FFFFFF" w:sz="0"/>
-              <w:left w:val="none" w:color="FFFFFF" w:sz="0"/>
-              <w:bottom w:val="single" w:color="D9D7CF" w:sz="4"/>
-              <w:right w:val="none" w:color="FFFFFF" w:sz="0"/>
-            </w:tcBorders>
-            <w:tcMar>
-              <w:top w:type="dxa" w:w="50"/>
-              <w:left w:type="dxa" w:w="0"/>
-              <w:bottom w:type="dxa" w:w="50"/>
-              <w:right w:type="dxa" w:w="120"/>
-            </w:tcMar>
-            <w:vAlign w:val="top"/>
-          </w:tcPr>
-          <w:p>
-            <w:pPr>
-              <w:keepNext/>
-              <w:jc w:val="left"/>
-            </w:pPr>
-            <w:r>
-              <w:rPr>
-                <w:rFonts w:ascii="Arial" w:cs="Arial" w:eastAsia="Arial" w:hAnsi="Arial"/>
-                <w:b w:val="false"/>
-                <w:bCs w:val="false"/>
-                <w:color w:val="1D1D1B"/>
-                <w:sz w:val="18"/>
-                <w:szCs w:val="18"/>
-              </w:rPr>
-              <w:t xml:space="preserve">Value of staff time at $55/hour</w:t>
-            </w:r>
-          </w:p>
-        </w:tc>
-        <w:tc>
-          <w:tcPr>
-            <w:tcW w:type="dxa" w:w="3663"/>
-            <w:tcBorders>
-              <w:top w:val="none" w:color="FFFFFF" w:sz="0"/>
-              <w:left w:val="none" w:color="FFFFFF" w:sz="0"/>
-              <w:bottom w:val="single" w:color="D9D7CF" w:sz="4"/>
-              <w:right w:val="none" w:color="FFFFFF" w:sz="0"/>
-            </w:tcBorders>
-            <w:tcMar>
-              <w:top w:type="dxa" w:w="50"/>
-              <w:left w:type="dxa" w:w="0"/>
-              <w:bottom w:type="dxa" w:w="50"/>
-              <w:right w:type="dxa" w:w="120"/>
-            </w:tcMar>
-            <w:vAlign w:val="top"/>
-          </w:tcPr>
-          <w:p>
-            <w:pPr>
-              <w:keepNext/>
-              <w:jc w:val="right"/>
-            </w:pPr>
-            <w:r>
-              <w:rPr>
-                <w:rFonts w:ascii="Arial" w:cs="Arial" w:eastAsia="Arial" w:hAnsi="Arial"/>
-                <w:b w:val="false"/>
-                <w:bCs w:val="false"/>
-                <w:color w:val="1D1D1B"/>
-                <w:sz w:val="18"/>
-                <w:szCs w:val="18"/>
-              </w:rPr>
-              <w:t xml:space="preserve">$4,400</w:t>
-            </w:r>
-          </w:p>
-        </w:tc>
-      </w:tr>
-      <w:tr>
-        <w:trPr>
-          <w:cantSplit/>
-        </w:trPr>
-        <w:tc>
-          <w:tcPr>
-            <w:tcW w:type="dxa" w:w="5977"/>
-            <w:tcBorders>
-              <w:top w:val="none" w:color="FFFFFF" w:sz="0"/>
-              <w:left w:val="none" w:color="FFFFFF" w:sz="0"/>
-              <w:bottom w:val="single" w:color="D9D7CF" w:sz="4"/>
-              <w:right w:val="none" w:color="FFFFFF" w:sz="0"/>
-            </w:tcBorders>
-            <w:tcMar>
-              <w:top w:type="dxa" w:w="50"/>
-              <w:left w:type="dxa" w:w="0"/>
-              <w:bottom w:type="dxa" w:w="50"/>
-              <w:right w:type="dxa" w:w="120"/>
-            </w:tcMar>
-            <w:vAlign w:val="top"/>
-          </w:tcPr>
-          <w:p>
-            <w:pPr>
-              <w:keepNext/>
-              <w:jc w:val="left"/>
-            </w:pPr>
-            <w:r>
-              <w:rPr>
-                <w:rFonts w:ascii="Arial" w:cs="Arial" w:eastAsia="Arial" w:hAnsi="Arial"/>
-                <w:b w:val="false"/>
-                <w:bCs w:val="false"/>
-                <w:color w:val="1D1D1B"/>
-                <w:sz w:val="18"/>
-                <w:szCs w:val="18"/>
-              </w:rPr>
-              <w:t xml:space="preserve">Running cost (AI processing and hosting)</w:t>
-            </w:r>
-          </w:p>
-        </w:tc>
-        <w:tc>
-          <w:tcPr>
-            <w:tcW w:type="dxa" w:w="3663"/>
-            <w:tcBorders>
-              <w:top w:val="none" w:color="FFFFFF" w:sz="0"/>
-              <w:left w:val="none" w:color="FFFFFF" w:sz="0"/>
-              <w:bottom w:val="single" w:color="D9D7CF" w:sz="4"/>
-              <w:right w:val="none" w:color="FFFFFF" w:sz="0"/>
-            </w:tcBorders>
-            <w:tcMar>
-              <w:top w:type="dxa" w:w="50"/>
-              <w:left w:type="dxa" w:w="0"/>
-              <w:bottom w:type="dxa" w:w="50"/>
-              <w:right w:type="dxa" w:w="120"/>
-            </w:tcMar>
-            <w:vAlign w:val="top"/>
-          </w:tcPr>
-          <w:p>
-            <w:pPr>
-              <w:keepNext/>
-              <w:jc w:val="right"/>
-            </w:pPr>
-            <w:r>
-              <w:rPr>
-                <w:rFonts w:ascii="Arial" w:cs="Arial" w:eastAsia="Arial" w:hAnsi="Arial"/>
-                <w:b w:val="false"/>
-                <w:bCs w:val="false"/>
-                <w:color w:val="1D1D1B"/>
-                <w:sz w:val="18"/>
-                <w:szCs w:val="18"/>
-              </w:rPr>
-              <w:t xml:space="preserve">$1,800</w:t>
-            </w:r>
-          </w:p>
-        </w:tc>
-      </w:tr>
-      <w:tr>
-        <w:trPr>
-          <w:cantSplit/>
-        </w:trPr>
-        <w:tc>
-          <w:tcPr>
-            <w:tcW w:type="dxa" w:w="5977"/>
-            <w:tcBorders>
-              <w:top w:val="single" w:color="1D1D1B" w:sz="8"/>
-              <w:left w:val="none" w:color="FFFFFF" w:sz="0"/>
-              <w:bottom w:val="none" w:color="FFFFFF" w:sz="0"/>
-              <w:right w:val="none" w:color="FFFFFF" w:sz="0"/>
-            </w:tcBorders>
-            <w:tcMar>
-              <w:top w:type="dxa" w:w="50"/>
-              <w:left w:type="dxa" w:w="0"/>
-              <w:bottom w:type="dxa" w:w="50"/>
-              <w:right w:type="dxa" w:w="120"/>
-            </w:tcMar>
-            <w:vAlign w:val="top"/>
-          </w:tcPr>
-          <w:p>
-            <w:pPr>
-              <w:keepNext w:val="false"/>
-              <w:jc w:val="left"/>
-            </w:pPr>
-            <w:r>
-              <w:rPr>
-                <w:rFonts w:ascii="Arial" w:cs="Arial" w:eastAsia="Arial" w:hAnsi="Arial"/>
-                <w:b/>
-                <w:bCs/>
-                <w:color w:val="1D1D1B"/>
-                <w:sz w:val="18"/>
-                <w:szCs w:val="18"/>
-              </w:rPr>
-              <w:t xml:space="preserve">Net value per year</w:t>
-            </w:r>
-          </w:p>
-        </w:tc>
-        <w:tc>
-          <w:tcPr>
-            <w:tcW w:type="dxa" w:w="3663"/>
-            <w:tcBorders>
-              <w:top w:val="single" w:color="1D1D1B" w:sz="8"/>
-              <w:left w:val="none" w:color="FFFFFF" w:sz="0"/>
-              <w:bottom w:val="none" w:color="FFFFFF" w:sz="0"/>
-              <w:right w:val="none" w:color="FFFFFF" w:sz="0"/>
-            </w:tcBorders>
-            <w:tcMar>
-              <w:top w:type="dxa" w:w="50"/>
-              <w:left w:type="dxa" w:w="0"/>
-              <w:bottom w:type="dxa" w:w="50"/>
-              <w:right w:type="dxa" w:w="120"/>
-            </w:tcMar>
-            <w:vAlign w:val="top"/>
-          </w:tcPr>
-          <w:p>
-            <w:pPr>
-              <w:keepNext w:val="false"/>
-              <w:jc w:val="right"/>
-            </w:pPr>
-            <w:r>
-              <w:rPr>
-                <w:rFonts w:ascii="Arial" w:cs="Arial" w:eastAsia="Arial" w:hAnsi="Arial"/>
-                <w:b/>
-                <w:bCs/>
-                <w:color w:val="1D1D1B"/>
-                <w:sz w:val="18"/>
-                <w:szCs w:val="18"/>
-              </w:rPr>
-              <w:t xml:space="preserve">$2,500</w:t>
-            </w:r>
-          </w:p>
-        </w:tc>
-      </w:tr>
-    </w:tbl>
-    <w:p>
-      <w:pPr>
-        <w:spacing w:after="120"/>
-      </w:pPr>
+        <w:t xml:space="preserve">Value grows with volume</w:t>
+      </w:r>
     </w:p>
     <w:p>
       <w:pPr>
         <w:keepNext/>
       </w:pPr>
       <w:r>
-        <w:t xml:space="preserve">Most of the running cost is hosting, which stays the same as volume rises, so the net value grows faster than volume. Per day and per year at different volumes:</w:t>
+        <w:t xml:space="preserve">At 20 documents a day the system returns about 79 staff hours a year, worth $3k after running costs. Most of the running cost is hosting, which stays the same as volume rises, so the value grows faster than the volume does.</w:t>
       </w:r>
     </w:p>
     <w:tbl>
@@ -1977,6 +1556,411 @@
     </w:p>
     <w:p>
       <w:pPr>
+        <w:pStyle w:val="Heading1"/>
+      </w:pPr>
+      <w:r>
+        <w:t xml:space="preserve">Annual value at 20 documents a day</w:t>
+      </w:r>
+    </w:p>
+    <w:tbl>
+      <w:tblPr>
+        <w:tblW w:type="dxa" w:w="9640"/>
+        <w:tblBorders>
+          <w:top w:val="single" w:color="auto" w:sz="4"/>
+          <w:left w:val="single" w:color="auto" w:sz="4"/>
+          <w:bottom w:val="single" w:color="auto" w:sz="4"/>
+          <w:right w:val="single" w:color="auto" w:sz="4"/>
+          <w:insideH w:val="single" w:color="auto" w:sz="4"/>
+          <w:insideV w:val="single" w:color="auto" w:sz="4"/>
+        </w:tblBorders>
+      </w:tblPr>
+      <w:tblGrid>
+        <w:gridCol w:w="5977"/>
+        <w:gridCol w:w="3663"/>
+      </w:tblGrid>
+      <w:tr>
+        <w:trPr>
+          <w:cantSplit/>
+        </w:trPr>
+        <w:tc>
+          <w:tcPr>
+            <w:tcW w:type="dxa" w:w="5977"/>
+            <w:tcBorders>
+              <w:top w:val="none" w:color="FFFFFF" w:sz="0"/>
+              <w:left w:val="none" w:color="FFFFFF" w:sz="0"/>
+              <w:bottom w:val="single" w:color="D9D7CF" w:sz="4"/>
+              <w:right w:val="none" w:color="FFFFFF" w:sz="0"/>
+            </w:tcBorders>
+            <w:tcMar>
+              <w:top w:type="dxa" w:w="50"/>
+              <w:left w:type="dxa" w:w="0"/>
+              <w:bottom w:type="dxa" w:w="50"/>
+              <w:right w:type="dxa" w:w="120"/>
+            </w:tcMar>
+            <w:vAlign w:val="top"/>
+          </w:tcPr>
+          <w:p>
+            <w:pPr>
+              <w:keepNext/>
+              <w:jc w:val="left"/>
+            </w:pPr>
+            <w:r>
+              <w:rPr>
+                <w:rFonts w:ascii="Arial" w:cs="Arial" w:eastAsia="Arial" w:hAnsi="Arial"/>
+                <w:b w:val="false"/>
+                <w:bCs w:val="false"/>
+                <w:color w:val="1D1D1B"/>
+                <w:sz w:val="18"/>
+                <w:szCs w:val="18"/>
+              </w:rPr>
+              <w:t xml:space="preserve">Documents per year (20 a day, 250 working days)</w:t>
+            </w:r>
+          </w:p>
+        </w:tc>
+        <w:tc>
+          <w:tcPr>
+            <w:tcW w:type="dxa" w:w="3663"/>
+            <w:tcBorders>
+              <w:top w:val="none" w:color="FFFFFF" w:sz="0"/>
+              <w:left w:val="none" w:color="FFFFFF" w:sz="0"/>
+              <w:bottom w:val="single" w:color="D9D7CF" w:sz="4"/>
+              <w:right w:val="none" w:color="FFFFFF" w:sz="0"/>
+            </w:tcBorders>
+            <w:tcMar>
+              <w:top w:type="dxa" w:w="50"/>
+              <w:left w:type="dxa" w:w="0"/>
+              <w:bottom w:type="dxa" w:w="50"/>
+              <w:right w:type="dxa" w:w="120"/>
+            </w:tcMar>
+            <w:vAlign w:val="top"/>
+          </w:tcPr>
+          <w:p>
+            <w:pPr>
+              <w:keepNext/>
+              <w:jc w:val="right"/>
+            </w:pPr>
+            <w:r>
+              <w:rPr>
+                <w:rFonts w:ascii="Arial" w:cs="Arial" w:eastAsia="Arial" w:hAnsi="Arial"/>
+                <w:b w:val="false"/>
+                <w:bCs w:val="false"/>
+                <w:color w:val="1D1D1B"/>
+                <w:sz w:val="18"/>
+                <w:szCs w:val="18"/>
+              </w:rPr>
+              <w:t xml:space="preserve">5,000</w:t>
+            </w:r>
+          </w:p>
+        </w:tc>
+      </w:tr>
+      <w:tr>
+        <w:trPr>
+          <w:cantSplit/>
+        </w:trPr>
+        <w:tc>
+          <w:tcPr>
+            <w:tcW w:type="dxa" w:w="5977"/>
+            <w:tcBorders>
+              <w:top w:val="none" w:color="FFFFFF" w:sz="0"/>
+              <w:left w:val="none" w:color="FFFFFF" w:sz="0"/>
+              <w:bottom w:val="single" w:color="D9D7CF" w:sz="4"/>
+              <w:right w:val="none" w:color="FFFFFF" w:sz="0"/>
+            </w:tcBorders>
+            <w:tcMar>
+              <w:top w:type="dxa" w:w="50"/>
+              <w:left w:type="dxa" w:w="0"/>
+              <w:bottom w:type="dxa" w:w="50"/>
+              <w:right w:type="dxa" w:w="120"/>
+            </w:tcMar>
+            <w:vAlign w:val="top"/>
+          </w:tcPr>
+          <w:p>
+            <w:pPr>
+              <w:keepNext/>
+              <w:jc w:val="left"/>
+            </w:pPr>
+            <w:r>
+              <w:rPr>
+                <w:rFonts w:ascii="Arial" w:cs="Arial" w:eastAsia="Arial" w:hAnsi="Arial"/>
+                <w:b w:val="false"/>
+                <w:bCs w:val="false"/>
+                <w:color w:val="1D1D1B"/>
+                <w:sz w:val="18"/>
+                <w:szCs w:val="18"/>
+              </w:rPr>
+              <w:t xml:space="preserve">Staff hours returned per year</w:t>
+            </w:r>
+          </w:p>
+        </w:tc>
+        <w:tc>
+          <w:tcPr>
+            <w:tcW w:type="dxa" w:w="3663"/>
+            <w:tcBorders>
+              <w:top w:val="none" w:color="FFFFFF" w:sz="0"/>
+              <w:left w:val="none" w:color="FFFFFF" w:sz="0"/>
+              <w:bottom w:val="single" w:color="D9D7CF" w:sz="4"/>
+              <w:right w:val="none" w:color="FFFFFF" w:sz="0"/>
+            </w:tcBorders>
+            <w:tcMar>
+              <w:top w:type="dxa" w:w="50"/>
+              <w:left w:type="dxa" w:w="0"/>
+              <w:bottom w:type="dxa" w:w="50"/>
+              <w:right w:type="dxa" w:w="120"/>
+            </w:tcMar>
+            <w:vAlign w:val="top"/>
+          </w:tcPr>
+          <w:p>
+            <w:pPr>
+              <w:keepNext/>
+              <w:jc w:val="right"/>
+            </w:pPr>
+            <w:r>
+              <w:rPr>
+                <w:rFonts w:ascii="Arial" w:cs="Arial" w:eastAsia="Arial" w:hAnsi="Arial"/>
+                <w:b w:val="false"/>
+                <w:bCs w:val="false"/>
+                <w:color w:val="1D1D1B"/>
+                <w:sz w:val="18"/>
+                <w:szCs w:val="18"/>
+              </w:rPr>
+              <w:t xml:space="preserve">79</w:t>
+            </w:r>
+          </w:p>
+        </w:tc>
+      </w:tr>
+      <w:tr>
+        <w:trPr>
+          <w:cantSplit/>
+        </w:trPr>
+        <w:tc>
+          <w:tcPr>
+            <w:tcW w:type="dxa" w:w="5977"/>
+            <w:tcBorders>
+              <w:top w:val="none" w:color="FFFFFF" w:sz="0"/>
+              <w:left w:val="none" w:color="FFFFFF" w:sz="0"/>
+              <w:bottom w:val="single" w:color="D9D7CF" w:sz="4"/>
+              <w:right w:val="none" w:color="FFFFFF" w:sz="0"/>
+            </w:tcBorders>
+            <w:tcMar>
+              <w:top w:type="dxa" w:w="50"/>
+              <w:left w:type="dxa" w:w="0"/>
+              <w:bottom w:type="dxa" w:w="50"/>
+              <w:right w:type="dxa" w:w="120"/>
+            </w:tcMar>
+            <w:vAlign w:val="top"/>
+          </w:tcPr>
+          <w:p>
+            <w:pPr>
+              <w:keepNext/>
+              <w:jc w:val="left"/>
+            </w:pPr>
+            <w:r>
+              <w:rPr>
+                <w:rFonts w:ascii="Arial" w:cs="Arial" w:eastAsia="Arial" w:hAnsi="Arial"/>
+                <w:b w:val="false"/>
+                <w:bCs w:val="false"/>
+                <w:color w:val="1D1D1B"/>
+                <w:sz w:val="18"/>
+                <w:szCs w:val="18"/>
+              </w:rPr>
+              <w:t xml:space="preserve">Value of staff time at $55/hour</w:t>
+            </w:r>
+          </w:p>
+        </w:tc>
+        <w:tc>
+          <w:tcPr>
+            <w:tcW w:type="dxa" w:w="3663"/>
+            <w:tcBorders>
+              <w:top w:val="none" w:color="FFFFFF" w:sz="0"/>
+              <w:left w:val="none" w:color="FFFFFF" w:sz="0"/>
+              <w:bottom w:val="single" w:color="D9D7CF" w:sz="4"/>
+              <w:right w:val="none" w:color="FFFFFF" w:sz="0"/>
+            </w:tcBorders>
+            <w:tcMar>
+              <w:top w:type="dxa" w:w="50"/>
+              <w:left w:type="dxa" w:w="0"/>
+              <w:bottom w:type="dxa" w:w="50"/>
+              <w:right w:type="dxa" w:w="120"/>
+            </w:tcMar>
+            <w:vAlign w:val="top"/>
+          </w:tcPr>
+          <w:p>
+            <w:pPr>
+              <w:keepNext/>
+              <w:jc w:val="right"/>
+            </w:pPr>
+            <w:r>
+              <w:rPr>
+                <w:rFonts w:ascii="Arial" w:cs="Arial" w:eastAsia="Arial" w:hAnsi="Arial"/>
+                <w:b w:val="false"/>
+                <w:bCs w:val="false"/>
+                <w:color w:val="1D1D1B"/>
+                <w:sz w:val="18"/>
+                <w:szCs w:val="18"/>
+              </w:rPr>
+              <w:t xml:space="preserve">$4,400</w:t>
+            </w:r>
+          </w:p>
+        </w:tc>
+      </w:tr>
+      <w:tr>
+        <w:trPr>
+          <w:cantSplit/>
+        </w:trPr>
+        <w:tc>
+          <w:tcPr>
+            <w:tcW w:type="dxa" w:w="5977"/>
+            <w:tcBorders>
+              <w:top w:val="none" w:color="FFFFFF" w:sz="0"/>
+              <w:left w:val="none" w:color="FFFFFF" w:sz="0"/>
+              <w:bottom w:val="single" w:color="D9D7CF" w:sz="4"/>
+              <w:right w:val="none" w:color="FFFFFF" w:sz="0"/>
+            </w:tcBorders>
+            <w:tcMar>
+              <w:top w:type="dxa" w:w="50"/>
+              <w:left w:type="dxa" w:w="0"/>
+              <w:bottom w:type="dxa" w:w="50"/>
+              <w:right w:type="dxa" w:w="120"/>
+            </w:tcMar>
+            <w:vAlign w:val="top"/>
+          </w:tcPr>
+          <w:p>
+            <w:pPr>
+              <w:keepNext/>
+              <w:jc w:val="left"/>
+            </w:pPr>
+            <w:r>
+              <w:rPr>
+                <w:rFonts w:ascii="Arial" w:cs="Arial" w:eastAsia="Arial" w:hAnsi="Arial"/>
+                <w:b w:val="false"/>
+                <w:bCs w:val="false"/>
+                <w:color w:val="1D1D1B"/>
+                <w:sz w:val="18"/>
+                <w:szCs w:val="18"/>
+              </w:rPr>
+              <w:t xml:space="preserve">Running cost (AI processing and hosting)</w:t>
+            </w:r>
+          </w:p>
+        </w:tc>
+        <w:tc>
+          <w:tcPr>
+            <w:tcW w:type="dxa" w:w="3663"/>
+            <w:tcBorders>
+              <w:top w:val="none" w:color="FFFFFF" w:sz="0"/>
+              <w:left w:val="none" w:color="FFFFFF" w:sz="0"/>
+              <w:bottom w:val="single" w:color="D9D7CF" w:sz="4"/>
+              <w:right w:val="none" w:color="FFFFFF" w:sz="0"/>
+            </w:tcBorders>
+            <w:tcMar>
+              <w:top w:type="dxa" w:w="50"/>
+              <w:left w:type="dxa" w:w="0"/>
+              <w:bottom w:type="dxa" w:w="50"/>
+              <w:right w:type="dxa" w:w="120"/>
+            </w:tcMar>
+            <w:vAlign w:val="top"/>
+          </w:tcPr>
+          <w:p>
+            <w:pPr>
+              <w:keepNext/>
+              <w:jc w:val="right"/>
+            </w:pPr>
+            <w:r>
+              <w:rPr>
+                <w:rFonts w:ascii="Arial" w:cs="Arial" w:eastAsia="Arial" w:hAnsi="Arial"/>
+                <w:b w:val="false"/>
+                <w:bCs w:val="false"/>
+                <w:color w:val="1D1D1B"/>
+                <w:sz w:val="18"/>
+                <w:szCs w:val="18"/>
+              </w:rPr>
+              <w:t xml:space="preserve">$1,800</w:t>
+            </w:r>
+          </w:p>
+        </w:tc>
+      </w:tr>
+      <w:tr>
+        <w:trPr>
+          <w:cantSplit/>
+        </w:trPr>
+        <w:tc>
+          <w:tcPr>
+            <w:tcW w:type="dxa" w:w="5977"/>
+            <w:tcBorders>
+              <w:top w:val="single" w:color="1D1D1B" w:sz="8"/>
+              <w:left w:val="none" w:color="FFFFFF" w:sz="0"/>
+              <w:bottom w:val="none" w:color="FFFFFF" w:sz="0"/>
+              <w:right w:val="none" w:color="FFFFFF" w:sz="0"/>
+            </w:tcBorders>
+            <w:tcMar>
+              <w:top w:type="dxa" w:w="50"/>
+              <w:left w:type="dxa" w:w="0"/>
+              <w:bottom w:type="dxa" w:w="50"/>
+              <w:right w:type="dxa" w:w="120"/>
+            </w:tcMar>
+            <w:vAlign w:val="top"/>
+          </w:tcPr>
+          <w:p>
+            <w:pPr>
+              <w:keepNext w:val="false"/>
+              <w:jc w:val="left"/>
+            </w:pPr>
+            <w:r>
+              <w:rPr>
+                <w:rFonts w:ascii="Arial" w:cs="Arial" w:eastAsia="Arial" w:hAnsi="Arial"/>
+                <w:b/>
+                <w:bCs/>
+                <w:color w:val="1D1D1B"/>
+                <w:sz w:val="18"/>
+                <w:szCs w:val="18"/>
+              </w:rPr>
+              <w:t xml:space="preserve">Net value per year</w:t>
+            </w:r>
+          </w:p>
+        </w:tc>
+        <w:tc>
+          <w:tcPr>
+            <w:tcW w:type="dxa" w:w="3663"/>
+            <w:tcBorders>
+              <w:top w:val="single" w:color="1D1D1B" w:sz="8"/>
+              <w:left w:val="none" w:color="FFFFFF" w:sz="0"/>
+              <w:bottom w:val="none" w:color="FFFFFF" w:sz="0"/>
+              <w:right w:val="none" w:color="FFFFFF" w:sz="0"/>
+            </w:tcBorders>
+            <w:tcMar>
+              <w:top w:type="dxa" w:w="50"/>
+              <w:left w:type="dxa" w:w="0"/>
+              <w:bottom w:type="dxa" w:w="50"/>
+              <w:right w:type="dxa" w:w="120"/>
+            </w:tcMar>
+            <w:vAlign w:val="top"/>
+          </w:tcPr>
+          <w:p>
+            <w:pPr>
+              <w:keepNext w:val="false"/>
+              <w:jc w:val="right"/>
+            </w:pPr>
+            <w:r>
+              <w:rPr>
+                <w:rFonts w:ascii="Arial" w:cs="Arial" w:eastAsia="Arial" w:hAnsi="Arial"/>
+                <w:b/>
+                <w:bCs/>
+                <w:color w:val="1D1D1B"/>
+                <w:sz w:val="18"/>
+                <w:szCs w:val="18"/>
+              </w:rPr>
+              <w:t xml:space="preserve">$2,500</w:t>
+            </w:r>
+          </w:p>
+        </w:tc>
+      </w:tr>
+    </w:tbl>
+    <w:p>
+      <w:pPr>
+        <w:spacing w:after="120"/>
+      </w:pPr>
+    </w:p>
+    <w:p>
+      <w:pPr>
         <w:keepNext/>
       </w:pPr>
       <w:r>
@@ -2563,6 +2547,27 @@
           <w:szCs w:val="18"/>
         </w:rPr>
         <w:t xml:space="preserve">Azure list prices: Mistral Document AI $3.00 per 1,000 pages; gpt-6-luna $0.10 and $0.50 per million input and output tokens. Hosting is an estimate.</w:t>
+      </w:r>
+    </w:p>
+    <w:p>
+      <w:pPr>
+        <w:pStyle w:val="Heading1"/>
+      </w:pPr>
+      <w:r>
+        <w:t xml:space="preserve">How it was tested</w:t>
+      </w:r>
+    </w:p>
+    <w:p>
+      <w:pPr>
+        <w:keepNext w:val="false"/>
+      </w:pPr>
+      <w:r>
+        <w:rPr>
+          <w:color w:val="55534E"/>
+          <w:sz w:val="18"/>
+          <w:szCs w:val="18"/>
+        </w:rPr>
+        <w:t xml:space="preserve">The wire step was tested on six synthetic wire instruction layouts chosen to be hard to read: repeated digits, small type in dense tables, fax-quality scans and details on a second page, all scanned to images. 18 live readings of those layouts were run 100 times through the production software, which scores every value and decides what to flag. A character misread when the page is turned into text would pass the other checks; the check digit catches that for routing numbers, and for the other fields the reviewer's comparison with the document remains the control.</w:t>
       </w:r>
     </w:p>
     <w:p>

</xml_diff>